<commit_message>
Refactor: clean datasets (consolidated only), full data in excel report, enhanced ratio proofs with source derivations
</commit_message>
<xml_diff>
--- a/word_report.docx
+++ b/word_report.docx
@@ -3272,7 +3272,133 @@
           <w:i w:val="0"/>
           <w:sz w:val="22"/>
         </w:rPr>
-        <w:t>HCL FY2025: ROE = 0.1486 x 1.1091 x 1.5152 x 100 = 24.98%. Wipro FY2025: ROE = 0.1481 x 0.6950 x 1.5563 x 100 = 16.02%.</w:t>
+        <w:t>DuPont Derivation - HCL FY2025:</w:t>
+      </w:r>
+    </w:p>
+    <w:p>
+      <w:pPr>
+        <w:spacing w:after="40" w:line="240" w:lineRule="auto"/>
+      </w:pPr>
+      <w:r>
+        <w:rPr>
+          <w:rFonts w:ascii="Times New Roman" w:hAnsi="Times New Roman"/>
+          <w:b w:val="0"/>
+          <w:i w:val="0"/>
+          <w:sz w:val="20"/>
+        </w:rPr>
+        <w:t xml:space="preserve">  Net Profit Margin = PAT / Revenue = 17,399 / 1,17,055 = 0.1486 (PAT from HCL P&amp;L; Revenue from HCL P&amp;L)</w:t>
+      </w:r>
+    </w:p>
+    <w:p>
+      <w:pPr>
+        <w:spacing w:after="40" w:line="240" w:lineRule="auto"/>
+      </w:pPr>
+      <w:r>
+        <w:rPr>
+          <w:rFonts w:ascii="Times New Roman" w:hAnsi="Times New Roman"/>
+          <w:b w:val="0"/>
+          <w:i w:val="0"/>
+          <w:sz w:val="20"/>
+        </w:rPr>
+        <w:t xml:space="preserve">  Asset Turnover = Revenue / Total Assets = 1,17,055 / 1,05,544 = 1.1091 (Revenue from HCL P&amp;L; Total Assets from HCL Balance Sheet)</w:t>
+      </w:r>
+    </w:p>
+    <w:p>
+      <w:pPr>
+        <w:spacing w:after="40" w:line="240" w:lineRule="auto"/>
+      </w:pPr>
+      <w:r>
+        <w:rPr>
+          <w:rFonts w:ascii="Times New Roman" w:hAnsi="Times New Roman"/>
+          <w:b w:val="0"/>
+          <w:i w:val="0"/>
+          <w:sz w:val="20"/>
+        </w:rPr>
+        <w:t xml:space="preserve">  Equity Multiplier = Total Assets / Total Shareholders' Funds = 1,05,544 / 69,655 = 1.5152 (both from HCL Balance Sheet)</w:t>
+      </w:r>
+    </w:p>
+    <w:p>
+      <w:pPr>
+        <w:spacing w:after="40" w:line="240" w:lineRule="auto"/>
+      </w:pPr>
+      <w:r>
+        <w:rPr>
+          <w:rFonts w:ascii="Times New Roman" w:hAnsi="Times New Roman"/>
+          <w:b w:val="0"/>
+          <w:i w:val="0"/>
+          <w:sz w:val="20"/>
+        </w:rPr>
+        <w:t xml:space="preserve">  ROE = 0.1486 x 1.1091 x 1.5152 x 100 = 24.98%</w:t>
+      </w:r>
+    </w:p>
+    <w:p>
+      <w:pPr>
+        <w:spacing w:after="40" w:line="240" w:lineRule="auto"/>
+      </w:pPr>
+      <w:r>
+        <w:rPr>
+          <w:rFonts w:ascii="Times New Roman" w:hAnsi="Times New Roman"/>
+          <w:b w:val="0"/>
+          <w:i w:val="0"/>
+          <w:sz w:val="22"/>
+        </w:rPr>
+        <w:t>DuPont Derivation - Wipro FY2025:</w:t>
+      </w:r>
+    </w:p>
+    <w:p>
+      <w:pPr>
+        <w:spacing w:after="40" w:line="240" w:lineRule="auto"/>
+      </w:pPr>
+      <w:r>
+        <w:rPr>
+          <w:rFonts w:ascii="Times New Roman" w:hAnsi="Times New Roman"/>
+          <w:b w:val="0"/>
+          <w:i w:val="0"/>
+          <w:sz w:val="20"/>
+        </w:rPr>
+        <w:t xml:space="preserve">  Net Profit Margin = PAT / Revenue = 13,192.6 / 89,088.4 = 0.1481 (PAT from Wipro P&amp;L; Revenue from Wipro P&amp;L)</w:t>
+      </w:r>
+    </w:p>
+    <w:p>
+      <w:pPr>
+        <w:spacing w:after="40" w:line="240" w:lineRule="auto"/>
+      </w:pPr>
+      <w:r>
+        <w:rPr>
+          <w:rFonts w:ascii="Times New Roman" w:hAnsi="Times New Roman"/>
+          <w:b w:val="0"/>
+          <w:i w:val="0"/>
+          <w:sz w:val="20"/>
+        </w:rPr>
+        <w:t xml:space="preserve">  Asset Turnover = Revenue / Total Assets = 89,088.4 / 1,28,185.2 = 0.6950 (Revenue from Wipro P&amp;L; Total Assets from Wipro Balance Sheet)</w:t>
+      </w:r>
+    </w:p>
+    <w:p>
+      <w:pPr>
+        <w:spacing w:after="40" w:line="240" w:lineRule="auto"/>
+      </w:pPr>
+      <w:r>
+        <w:rPr>
+          <w:rFonts w:ascii="Times New Roman" w:hAnsi="Times New Roman"/>
+          <w:b w:val="0"/>
+          <w:i w:val="0"/>
+          <w:sz w:val="20"/>
+        </w:rPr>
+        <w:t xml:space="preserve">  Equity Multiplier = Total Assets / Total Shareholders' Funds = 1,28,185.2 / 82,364.1 = 1.5563 (both from Wipro Balance Sheet)</w:t>
+      </w:r>
+    </w:p>
+    <w:p>
+      <w:pPr>
+        <w:spacing w:after="40" w:line="240" w:lineRule="auto"/>
+      </w:pPr>
+      <w:r>
+        <w:rPr>
+          <w:rFonts w:ascii="Times New Roman" w:hAnsi="Times New Roman"/>
+          <w:b w:val="0"/>
+          <w:i w:val="0"/>
+          <w:sz w:val="20"/>
+        </w:rPr>
+        <w:t xml:space="preserve">  ROE = 0.1481 x 0.6950 x 1.5563 x 100 = 16.02%</w:t>
       </w:r>
     </w:p>
     <w:p>
@@ -3791,6 +3917,146 @@
           <w:rFonts w:ascii="Times New Roman" w:hAnsi="Times New Roman"/>
           <w:b w:val="0"/>
           <w:i w:val="0"/>
+          <w:sz w:val="20"/>
+        </w:rPr>
+        <w:t>CCC Derivation - HCL FY2025:</w:t>
+      </w:r>
+    </w:p>
+    <w:p>
+      <w:pPr>
+        <w:spacing w:after="40" w:line="240" w:lineRule="auto"/>
+      </w:pPr>
+      <w:r>
+        <w:rPr>
+          <w:rFonts w:ascii="Times New Roman" w:hAnsi="Times New Roman"/>
+          <w:b w:val="0"/>
+          <w:i w:val="0"/>
+          <w:sz w:val="20"/>
+        </w:rPr>
+        <w:t xml:space="preserve">  DIO = 365 x Avg(Inventories FY25, FY24) / COGS = 365 x Avg(133, 185) / 17,190 = 3.4 days (Inventories from HCL Balance Sheet; COGS = Purchase + Operating Exp + Inv Changes from HCL P&amp;L)</w:t>
+      </w:r>
+    </w:p>
+    <w:p>
+      <w:pPr>
+        <w:spacing w:after="40" w:line="240" w:lineRule="auto"/>
+      </w:pPr>
+      <w:r>
+        <w:rPr>
+          <w:rFonts w:ascii="Times New Roman" w:hAnsi="Times New Roman"/>
+          <w:b w:val="0"/>
+          <w:i w:val="0"/>
+          <w:sz w:val="20"/>
+        </w:rPr>
+        <w:t xml:space="preserve">  DSO = 365 x Avg(Trade Rec FY25, FY24) / Revenue = 365 x Avg(25,842, 25,521) / 1,17,055 = 80.1 days (Trade Receivables from HCL Balance Sheet; Revenue from HCL P&amp;L)</w:t>
+      </w:r>
+    </w:p>
+    <w:p>
+      <w:pPr>
+        <w:spacing w:after="40" w:line="240" w:lineRule="auto"/>
+      </w:pPr>
+      <w:r>
+        <w:rPr>
+          <w:rFonts w:ascii="Times New Roman" w:hAnsi="Times New Roman"/>
+          <w:b w:val="0"/>
+          <w:i w:val="0"/>
+          <w:sz w:val="20"/>
+        </w:rPr>
+        <w:t xml:space="preserve">  DPO = 365 x Avg(Trade Pay FY25, FY24) / Purchases = 365 x Avg(13,234, 5,853) / 24,744 = 140.8 days (Trade Payables from HCL Balance Sheet; Purchases = Purchase + Op Exp + Other Exp from HCL P&amp;L)</w:t>
+      </w:r>
+    </w:p>
+    <w:p>
+      <w:pPr>
+        <w:spacing w:after="40" w:line="240" w:lineRule="auto"/>
+      </w:pPr>
+      <w:r>
+        <w:rPr>
+          <w:rFonts w:ascii="Times New Roman" w:hAnsi="Times New Roman"/>
+          <w:b w:val="0"/>
+          <w:i w:val="0"/>
+          <w:sz w:val="20"/>
+        </w:rPr>
+        <w:t xml:space="preserve">  CCC = DIO + DSO - DPO = 3.4 + 80.1 - 140.8 = -57.3 days</w:t>
+      </w:r>
+    </w:p>
+    <w:p>
+      <w:pPr>
+        <w:spacing w:after="40" w:line="240" w:lineRule="auto"/>
+      </w:pPr>
+      <w:r>
+        <w:rPr>
+          <w:rFonts w:ascii="Times New Roman" w:hAnsi="Times New Roman"/>
+          <w:b w:val="0"/>
+          <w:i w:val="0"/>
+          <w:sz w:val="20"/>
+        </w:rPr>
+        <w:t>CCC Derivation - Wipro FY2025:</w:t>
+      </w:r>
+    </w:p>
+    <w:p>
+      <w:pPr>
+        <w:spacing w:after="40" w:line="240" w:lineRule="auto"/>
+      </w:pPr>
+      <w:r>
+        <w:rPr>
+          <w:rFonts w:ascii="Times New Roman" w:hAnsi="Times New Roman"/>
+          <w:b w:val="0"/>
+          <w:i w:val="0"/>
+          <w:sz w:val="20"/>
+        </w:rPr>
+        <w:t xml:space="preserve">  DIO = 365 x Avg(69.4, 90.7) / 12,649.0 = 2.3 days (Inventories from Wipro Balance Sheet; COGS from Wipro P&amp;L)</w:t>
+      </w:r>
+    </w:p>
+    <w:p>
+      <w:pPr>
+        <w:spacing w:after="40" w:line="240" w:lineRule="auto"/>
+      </w:pPr>
+      <w:r>
+        <w:rPr>
+          <w:rFonts w:ascii="Times New Roman" w:hAnsi="Times New Roman"/>
+          <w:b w:val="0"/>
+          <w:i w:val="0"/>
+          <w:sz w:val="20"/>
+        </w:rPr>
+        <w:t xml:space="preserve">  DSO = 365 x Avg(11,774.5, 17,382.2) / 89,088.4 = 59.7 days (Trade Receivables from Wipro Balance Sheet; Revenue from Wipro P&amp;L)</w:t>
+      </w:r>
+    </w:p>
+    <w:p>
+      <w:pPr>
+        <w:spacing w:after="40" w:line="240" w:lineRule="auto"/>
+      </w:pPr>
+      <w:r>
+        <w:rPr>
+          <w:rFonts w:ascii="Times New Roman" w:hAnsi="Times New Roman"/>
+          <w:b w:val="0"/>
+          <w:i w:val="0"/>
+          <w:sz w:val="20"/>
+        </w:rPr>
+        <w:t xml:space="preserve">  DPO = 365 x Avg(5,866.7, 5,765.5) / 17,700.0 = 119.9 days (Trade Payables from Wipro Balance Sheet; Purchases from Wipro P&amp;L)</w:t>
+      </w:r>
+    </w:p>
+    <w:p>
+      <w:pPr>
+        <w:spacing w:after="40" w:line="240" w:lineRule="auto"/>
+      </w:pPr>
+      <w:r>
+        <w:rPr>
+          <w:rFonts w:ascii="Times New Roman" w:hAnsi="Times New Roman"/>
+          <w:b w:val="0"/>
+          <w:i w:val="0"/>
+          <w:sz w:val="20"/>
+        </w:rPr>
+        <w:t xml:space="preserve">  CCC = 2.3 + 59.7 - 119.9 = -57.9 days</w:t>
+      </w:r>
+    </w:p>
+    <w:p>
+      <w:pPr>
+        <w:spacing w:after="40" w:line="240" w:lineRule="auto"/>
+      </w:pPr>
+      <w:r>
+        <w:rPr>
+          <w:rFonts w:ascii="Times New Roman" w:hAnsi="Times New Roman"/>
+          <w:b w:val="0"/>
+          <w:i w:val="0"/>
           <w:sz w:val="22"/>
         </w:rPr>
         <w:t>Both companies exhibit negative CCCs (HCL: -57.3 days, Wipro: -57.9 days), which is typical of IT services firms that collect from clients relatively quickly compared to their payment obligations, and hold negligible inventory. HCLTech's CCC is more negative, indicating superior working capital efficiency. However, HCLTech's DPO of 203 days is elevated in FY2025 due to a spike in trade payables (from Rs 5,853 crore to Rs 13,234 crore), which may reflect reclassification between 'Other Current Liabilities' and 'Trade Payables'. Both firms benefit from the IT services model where human capital rather than physical inventory drives operations, keeping DIO near zero across all years.</w:t>

</xml_diff>

<commit_message>
Add all team members to excel/word/proofs, sync CCC FY2021 with excel FY2020 averages
</commit_message>
<xml_diff>
--- a/word_report.docx
+++ b/word_report.docx
@@ -3622,7 +3622,7 @@
                 <w:rFonts w:ascii="Times New Roman" w:hAnsi="Times New Roman"/>
                 <w:sz w:val="18"/>
               </w:rPr>
-              <w:t>2.9</w:t>
+              <w:t>2.8</w:t>
             </w:r>
           </w:p>
         </w:tc>
@@ -3656,7 +3656,7 @@
                 <w:rFonts w:ascii="Times New Roman" w:hAnsi="Times New Roman"/>
                 <w:sz w:val="18"/>
               </w:rPr>
-              <w:t>3.0</w:t>
+              <w:t>4.2</w:t>
             </w:r>
           </w:p>
         </w:tc>
@@ -3709,7 +3709,7 @@
                 <w:rFonts w:ascii="Times New Roman" w:hAnsi="Times New Roman"/>
                 <w:sz w:val="18"/>
               </w:rPr>
-              <w:t>66.2</w:t>
+              <w:t>67.3</w:t>
             </w:r>
           </w:p>
         </w:tc>
@@ -3743,7 +3743,7 @@
                 <w:rFonts w:ascii="Times New Roman" w:hAnsi="Times New Roman"/>
                 <w:sz w:val="18"/>
               </w:rPr>
-              <w:t>55.6</w:t>
+              <w:t>58.6</w:t>
             </w:r>
           </w:p>
         </w:tc>
@@ -3796,7 +3796,7 @@
                 <w:rFonts w:ascii="Times New Roman" w:hAnsi="Times New Roman"/>
                 <w:sz w:val="18"/>
               </w:rPr>
-              <w:t>38.2</w:t>
+              <w:t>32.0</w:t>
             </w:r>
           </w:p>
         </w:tc>
@@ -3830,7 +3830,7 @@
                 <w:rFonts w:ascii="Times New Roman" w:hAnsi="Times New Roman"/>
                 <w:sz w:val="18"/>
               </w:rPr>
-              <w:t>142.3</w:t>
+              <w:t>147.9</w:t>
             </w:r>
           </w:p>
         </w:tc>
@@ -3883,7 +3883,7 @@
                 <w:rFonts w:ascii="Times New Roman" w:hAnsi="Times New Roman"/>
                 <w:sz w:val="18"/>
               </w:rPr>
-              <w:t>30.8</w:t>
+              <w:t>38.1</w:t>
             </w:r>
           </w:p>
         </w:tc>
@@ -3917,7 +3917,7 @@
                 <w:rFonts w:ascii="Times New Roman" w:hAnsi="Times New Roman"/>
                 <w:sz w:val="18"/>
               </w:rPr>
-              <w:t>-83.7</w:t>
+              <w:t>-85.1</w:t>
             </w:r>
           </w:p>
         </w:tc>

</xml_diff>